<commit_message>
Pasos logicos e ilustraciones generadas en Arquitectura, Programacion II, Seminario e Introduccion
Co-Authored-By: Claude Opus 5.5 <noreply@anthropic.com>
</commit_message>
<xml_diff>
--- a/Arquitectura de Sistemas Computacionales/Kit docente/Clase 3/Guion Docente Clase 3 - Virtualizacion y contenedores.docx
+++ b/Arquitectura de Sistemas Computacionales/Kit docente/Clase 3/Guion Docente Clase 3 - Virtualizacion y contenedores.docx
@@ -1161,28 +1161,33 @@
           <w:color w:val="4A4A49"/>
           <w:sz w:val="22"/>
         </w:rPr>
-        <w:t>[Slide 13] Primer ejemplo: el stub de la API de CloudLite</w:t>
-      </w:r>
-      <w:r>
-        <w:rPr>
-          <w:b w:val="0"/>
-          <w:color w:val="4A4A49"/>
-          <w:sz w:val="22"/>
-        </w:rPr>
-        <w:t xml:space="preserve"> — 3 vinetas.</w:t>
+        <w:t>[Slide 13] Comprobar en un lab: el Dockerfile vive en tu carpeta</w:t>
+      </w:r>
+      <w:r>
+        <w:rPr>
+          <w:b w:val="0"/>
+          <w:color w:val="4A4A49"/>
+          <w:sz w:val="22"/>
+        </w:rPr>
+        <w:t xml:space="preserve"> — 4 vinetas.</w:t>
       </w:r>
     </w:p>
     <w:p>
-      <w:pPr>
-        <w:pStyle w:val="ListBullet2"/>
-      </w:pPr>
-      <w:r>
-        <w:rPr>
-          <w:b w:val="0"/>
-          <w:color w:val="4A4A49"/>
-          <w:sz w:val="22"/>
-        </w:rPr>
-        <w:t>DESARROLLO (para explicarlo, no se proyecta):</w:t>
+      <w:r>
+        <w:rPr>
+          <w:b/>
+          <w:color w:val="4A4A49"/>
+          <w:sz w:val="22"/>
+        </w:rPr>
+        <w:t>[Slide 14] Primer ejemplo: el stub de la API de CloudLite</w:t>
+      </w:r>
+      <w:r>
+        <w:rPr>
+          <w:b w:val="0"/>
+          <w:color w:val="4A4A49"/>
+          <w:sz w:val="22"/>
+        </w:rPr>
+        <w:t xml:space="preserve"> — 3 vinetas.</w:t>
       </w:r>
     </w:p>
     <w:p>
@@ -1195,7 +1200,7 @@
           <w:color w:val="4A4A49"/>
           <w:sz w:val="22"/>
         </w:rPr>
-        <w:t>FROM node:20-alpine elige la imagen base, o sea el punto de partida ya construido por otros, en este caso un Linux minimo con Node instalado; la etiqueta 20-alpine es FIJA y eso importa</w:t>
+        <w:t>DESARROLLO (para explicarlo, no se proyecta):</w:t>
       </w:r>
     </w:p>
     <w:p>
@@ -1208,7 +1213,7 @@
           <w:color w:val="4A4A49"/>
           <w:sz w:val="22"/>
         </w:rPr>
-        <w:t>Porque con latest la imagen de hoy no es la de manana y la reconstruccion deja de ser reproducible.</w:t>
+        <w:t>FROM node:20-alpine elige la imagen base, o sea el punto de partida ya construido por otros, en este caso un Linux minimo con Node instalado; la etiqueta 20-alpine es FIJA y eso importa</w:t>
       </w:r>
     </w:p>
     <w:p>
@@ -1221,7 +1226,7 @@
           <w:color w:val="4A4A49"/>
           <w:sz w:val="22"/>
         </w:rPr>
-        <w:t>RUN npm ci --omit=dev las instala dentro de la imagen y no en la maquina del estudiante, lo cual es el punto entero del ejercicio</w:t>
+        <w:t>Porque con latest la imagen de hoy no es la de manana y la reconstruccion deja de ser reproducible.</w:t>
       </w:r>
     </w:p>
     <w:p>
@@ -1234,7 +1239,7 @@
           <w:color w:val="4A4A49"/>
           <w:sz w:val="22"/>
         </w:rPr>
-        <w:t>Porque la dependencia viaja con el artefacto; se usa npm ci y no npm install porque respeta el archivo de bloqueo y por tanto instala exactamente las mismas versiones en cada construccion.</w:t>
+        <w:t>RUN npm ci --omit=dev las instala dentro de la imagen y no en la maquina del estudiante, lo cual es el punto entero del ejercicio</w:t>
       </w:r>
     </w:p>
     <w:p>
@@ -1247,7 +1252,7 @@
           <w:color w:val="4A4A49"/>
           <w:sz w:val="22"/>
         </w:rPr>
-        <w:t>EXPOSE 8080 documenta en que puerto escucha el proceso.</w:t>
+        <w:t>Porque la dependencia viaja con el artefacto; se usa npm ci y no npm install porque respeta el archivo de bloqueo y por tanto instala exactamente las mismas versiones en cada construccion.</w:t>
       </w:r>
     </w:p>
     <w:p>
@@ -1260,7 +1265,7 @@
           <w:color w:val="4A4A49"/>
           <w:sz w:val="22"/>
         </w:rPr>
-        <w:t>Ese COPY.. tiene una consecuencia seria: copia TODO lo que haya en la carpeta, incluido el archivo.env con las credenciales, y una vez dentro de una capa ya no sale, ni siquiera borrandolo en una instruccion posterior.</w:t>
+        <w:t>EXPOSE 8080 documenta en que puerto escucha el proceso.</w:t>
       </w:r>
     </w:p>
     <w:p>
@@ -1273,7 +1278,7 @@
           <w:color w:val="4A4A49"/>
           <w:sz w:val="22"/>
         </w:rPr>
-        <w:t>La regla se enuncia en una linea: si haces COPY.., el.dockerignore va al lado y se menciona en la entrega.</w:t>
+        <w:t>Ese COPY.. tiene una consecuencia seria: copia TODO lo que haya en la carpeta, incluido el archivo.env con las credenciales, y una vez dentro de una capa ya no sale, ni siquiera borrandolo en una instruccion posterior.</w:t>
       </w:r>
     </w:p>
     <w:p>
@@ -1286,7 +1291,7 @@
           <w:color w:val="4A4A49"/>
           <w:sz w:val="22"/>
         </w:rPr>
-        <w:t>Un ultimo detalle del que depende media clase: EXPOSE no abre nada, solo documenta.</w:t>
+        <w:t>La regla se enuncia en una linea: si haces COPY.., el.dockerignore va al lado y se menciona en la entrega.</w:t>
       </w:r>
     </w:p>
     <w:p>
@@ -1299,7 +1304,7 @@
           <w:color w:val="4A4A49"/>
           <w:sz w:val="22"/>
         </w:rPr>
-        <w:t>NOTAS:</w:t>
+        <w:t>Un ultimo detalle del que depende media clase: EXPOSE no abre nada, solo documenta.</w:t>
       </w:r>
     </w:p>
     <w:p>
@@ -1312,7 +1317,7 @@
           <w:color w:val="4A4A49"/>
           <w:sz w:val="22"/>
         </w:rPr>
-        <w:t>Primer ejemplo concreto en CloudLite.</w:t>
+        <w:t>NOTAS:</w:t>
       </w:r>
     </w:p>
     <w:p>
@@ -1325,7 +1330,7 @@
           <w:color w:val="4A4A49"/>
           <w:sz w:val="22"/>
         </w:rPr>
-        <w:t>WORKDIR /app fija el directorio dentro del contenedor donde ocurrira todo lo demas.</w:t>
+        <w:t>Primer ejemplo concreto en CloudLite.</w:t>
       </w:r>
     </w:p>
     <w:p>
@@ -1338,7 +1343,7 @@
           <w:color w:val="4A4A49"/>
           <w:sz w:val="22"/>
         </w:rPr>
-        <w:t>COPY package*.json./ trae solo la lista de dependencias.</w:t>
+        <w:t>WORKDIR /app fija el directorio dentro del contenedor donde ocurrira todo lo demas.</w:t>
       </w:r>
     </w:p>
     <w:p>
@@ -1351,7 +1356,7 @@
           <w:color w:val="4A4A49"/>
           <w:sz w:val="22"/>
         </w:rPr>
-        <w:t>COPY.. trae el resto del codigo, y va DESPUES por la razon de cache de la seccion anterior.</w:t>
+        <w:t>COPY package*.json./ trae solo la lista de dependencias.</w:t>
       </w:r>
     </w:p>
     <w:p>
@@ -1364,7 +1369,7 @@
           <w:color w:val="4A4A49"/>
           <w:sz w:val="22"/>
         </w:rPr>
-        <w:t>Y CMD indica que comando ejecutar cuando el contenedor arranque, uno solo y en primer plano.</w:t>
+        <w:t>COPY.. trae el resto del codigo, y va DESPUES por la razon de cache de la seccion anterior.</w:t>
       </w:r>
     </w:p>
     <w:p>
@@ -1377,7 +1382,7 @@
           <w:color w:val="4A4A49"/>
           <w:sz w:val="22"/>
         </w:rPr>
-        <w:t>Por eso al lado del Dockerfile va un segundo archivo, el.dockerignore, con al menos.env, node_modules y.git.</w:t>
+        <w:t>Y CMD indica que comando ejecutar cuando el contenedor arranque, uno solo y en primer plano.</w:t>
       </w:r>
     </w:p>
     <w:p>
@@ -1390,7 +1395,7 @@
           <w:color w:val="4A4A49"/>
           <w:sz w:val="22"/>
         </w:rPr>
-        <w:t>Lo que realmente publica el puerto es la opcion -p al ejecutar, y ese es el tema de la diapositiva siguiente.</w:t>
+        <w:t>Por eso al lado del Dockerfile va un segundo archivo, el.dockerignore, con al menos.env, node_modules y.git.</w:t>
       </w:r>
     </w:p>
     <w:p>
@@ -1403,7 +1408,7 @@
           <w:color w:val="4A4A49"/>
           <w:sz w:val="22"/>
         </w:rPr>
-        <w:t>(No se proyecta) En CloudLite Turnos el estudiante contenerizara un stub de su API, es decir una version minima que responde algo verificable: el endpoint GET /health, que devuelve un cuerpo en formato JSON con al menos un campo que se pueda comprobar.</w:t>
+        <w:t>Lo que realmente publica el puerto es la opcion -p al ejecutar, y ese es el tema de la diapositiva siguiente.</w:t>
       </w:r>
     </w:p>
     <w:p>
@@ -1416,7 +1421,7 @@
           <w:color w:val="4A4A49"/>
           <w:sz w:val="22"/>
         </w:rPr>
-        <w:t>(No se proyecta) Su Dockerfile tiene siete instrucciones, y el docente debe poder explicar cada una.</w:t>
+        <w:t>(No se proyecta) En CloudLite Turnos el estudiante contenerizara un stub de su API, es decir una version minima que responde algo verificable: el endpoint GET /health, que devuelve un cuerpo en formato JSON con al menos un campo que se pueda comprobar.</w:t>
       </w:r>
     </w:p>
     <w:p>
@@ -1429,25 +1434,20 @@
           <w:color w:val="4A4A49"/>
           <w:sz w:val="22"/>
         </w:rPr>
-        <w:t>(No se proyecta) La diapositiva lo proyecta junto al Dockerfile y no como nota al pie a proposito: son dos archivos hermanos en la misma carpeta, y el estudiante que entrega el primero sin el segundo entrega un artefacto que filtra secretos.</w:t>
+        <w:t>(No se proyecta) Su Dockerfile tiene siete instrucciones, y el docente debe poder explicar cada una.</w:t>
       </w:r>
     </w:p>
     <w:p>
-      <w:r>
-        <w:rPr>
-          <w:b/>
-          <w:color w:val="4A4A49"/>
-          <w:sz w:val="22"/>
-        </w:rPr>
-        <w:t>[Slide 14] Comprobar en un lab: recomendado, no obligatorio</w:t>
-      </w:r>
-      <w:r>
-        <w:rPr>
-          <w:b w:val="0"/>
-          <w:color w:val="4A4A49"/>
-          <w:sz w:val="22"/>
-        </w:rPr>
-        <w:t xml:space="preserve"> — 4 vinetas.</w:t>
+      <w:pPr>
+        <w:pStyle w:val="ListBullet2"/>
+      </w:pPr>
+      <w:r>
+        <w:rPr>
+          <w:b w:val="0"/>
+          <w:color w:val="4A4A49"/>
+          <w:sz w:val="22"/>
+        </w:rPr>
+        <w:t>(No se proyecta) La diapositiva lo proyecta junto al Dockerfile y no como nota al pie a proposito: son dos archivos hermanos en la misma carpeta, y el estudiante que entrega el primero sin el segundo entrega un artefacto que filtra secretos.</w:t>
       </w:r>
     </w:p>
     <w:p>
@@ -2346,7 +2346,7 @@
           <w:color w:val="4A4A49"/>
           <w:sz w:val="22"/>
         </w:rPr>
-        <w:t>Primer ejemplo: el stub de la API de CloudLite</w:t>
+        <w:t>Comprobar en un lab: el Dockerfile vive en tu carpeta</w:t>
       </w:r>
     </w:p>
     <w:p>
@@ -2359,7 +2359,7 @@
           <w:color w:val="4A4A49"/>
           <w:sz w:val="22"/>
         </w:rPr>
-        <w:t>Comprobar en un lab: recomendado, no obligatorio</w:t>
+        <w:t>Primer ejemplo: el stub de la API de CloudLite</w:t>
       </w:r>
     </w:p>
     <w:p>
@@ -2599,15 +2599,15 @@
           <w:color w:val="4A4A49"/>
           <w:sz w:val="22"/>
         </w:rPr>
-        <w:t>Comprobar en un lab: recomendado, no obligatorio</w:t>
-      </w:r>
-      <w:r>
-        <w:rPr>
-          <w:b w:val="0"/>
-          <w:color w:val="4A4A49"/>
-          <w:sz w:val="22"/>
-        </w:rPr>
-        <w:t xml:space="preserve"> · [Slide 14]</w:t>
+        <w:t>Comprobar en un lab: el Dockerfile vive en tu carpeta</w:t>
+      </w:r>
+      <w:r>
+        <w:rPr>
+          <w:b w:val="0"/>
+          <w:color w:val="4A4A49"/>
+          <w:sz w:val="22"/>
+        </w:rPr>
+        <w:t xml:space="preserve"> · [Slide 13]</w:t>
       </w:r>
     </w:p>
     <w:p>

</xml_diff>